<commit_message>
feat: Lock CV documents strictly to 1 single page with single-row table architecture
</commit_message>
<xml_diff>
--- a/KOA_MARIE_GERVAIS_NELLY_CV_1PAGE.docx
+++ b/KOA_MARIE_GERVAIS_NELLY_CV_1PAGE.docx
@@ -17,19 +17,19 @@
         </w:tblBorders>
       </w:tblPr>
       <w:tblGrid>
-        <w:gridCol w:w="5760"/>
-        <w:gridCol w:w="5760"/>
+        <w:gridCol w:w="5832"/>
+        <w:gridCol w:w="5832"/>
       </w:tblGrid>
       <w:tr>
         <w:tc>
           <w:tcPr>
-            <w:tcW w:type="dxa" w:w="3456"/>
+            <w:tcW w:type="dxa" w:w="3312"/>
             <w:shd w:fill="0F172A"/>
             <w:tcMar>
-              <w:top w:w="120" w:type="dxa"/>
-              <w:bottom w:w="120" w:type="dxa"/>
-              <w:left w:w="140" w:type="dxa"/>
-              <w:right w:w="140" w:type="dxa"/>
+              <w:top w:w="100" w:type="dxa"/>
+              <w:bottom w:w="100" w:type="dxa"/>
+              <w:left w:w="120" w:type="dxa"/>
+              <w:right w:w="120" w:type="dxa"/>
             </w:tcMar>
           </w:tcPr>
           <w:p/>
@@ -40,29 +40,30 @@
               <w:tblLook w:firstColumn="1" w:firstRow="1" w:lastColumn="0" w:lastRow="0" w:noHBand="0" w:noVBand="1" w:val="04A0"/>
             </w:tblPr>
             <w:tblGrid>
-              <w:gridCol w:w="3456"/>
+              <w:gridCol w:w="3312"/>
             </w:tblGrid>
             <w:tr>
               <w:tc>
                 <w:tcPr>
-                  <w:tcW w:type="dxa" w:w="2304"/>
+                  <w:tcW w:type="dxa" w:w="2160"/>
                   <w:shd w:fill="1E293B"/>
                   <w:tcMar>
-                    <w:top w:w="140" w:type="dxa"/>
-                    <w:bottom w:w="140" w:type="dxa"/>
-                    <w:left w:w="80" w:type="dxa"/>
-                    <w:right w:w="80" w:type="dxa"/>
+                    <w:top w:w="100" w:type="dxa"/>
+                    <w:bottom w:w="100" w:type="dxa"/>
+                    <w:left w:w="60" w:type="dxa"/>
+                    <w:right w:w="60" w:type="dxa"/>
                   </w:tcMar>
                 </w:tcPr>
                 <w:p>
                   <w:pPr>
+                    <w:spacing w:before="0" w:after="0"/>
                     <w:jc w:val="center"/>
                   </w:pPr>
                   <w:r>
                     <w:rPr>
                       <w:b/>
                       <w:color w:val="38BDF8"/>
-                      <w:sz w:val="15"/>
+                      <w:sz w:val="14"/>
                     </w:rPr>
                     <w:t>📷 PHOTO CV</w:t>
                     <w:br/>
@@ -75,336 +76,348 @@
           <w:p/>
           <w:p>
             <w:pPr>
-              <w:spacing w:before="120" w:after="40"/>
+              <w:spacing w:before="100" w:after="20"/>
             </w:pPr>
             <w:r>
               <w:rPr>
                 <w:rFonts w:ascii="Segoe UI Semibold" w:hAnsi="Segoe UI Semibold"/>
                 <w:b/>
                 <w:color w:val="38BDF8"/>
-                <w:sz w:val="18"/>
+                <w:sz w:val="17"/>
               </w:rPr>
               <w:t>CONTACT</w:t>
             </w:r>
           </w:p>
           <w:p>
             <w:pPr>
-              <w:spacing w:before="0" w:after="30" w:line="252" w:lineRule="auto"/>
+              <w:spacing w:before="0" w:after="20" w:line="252" w:lineRule="auto"/>
             </w:pPr>
             <w:r>
               <w:rPr>
                 <w:color w:val="F8FAFC"/>
-                <w:sz w:val="16"/>
+                <w:sz w:val="15"/>
               </w:rPr>
               <w:t>✉  koagervais85@gmail.com</w:t>
             </w:r>
           </w:p>
           <w:p>
             <w:pPr>
-              <w:spacing w:before="0" w:after="30" w:line="252" w:lineRule="auto"/>
+              <w:spacing w:before="0" w:after="20" w:line="252" w:lineRule="auto"/>
             </w:pPr>
             <w:r>
               <w:rPr>
                 <w:color w:val="F8FAFC"/>
-                <w:sz w:val="16"/>
+                <w:sz w:val="15"/>
               </w:rPr>
               <w:t>✆  +237 695 35 34 02</w:t>
             </w:r>
           </w:p>
           <w:p>
             <w:pPr>
-              <w:spacing w:before="0" w:after="30" w:line="252" w:lineRule="auto"/>
+              <w:spacing w:before="0" w:after="20" w:line="252" w:lineRule="auto"/>
             </w:pPr>
             <w:r>
               <w:rPr>
                 <w:color w:val="F8FAFC"/>
-                <w:sz w:val="16"/>
+                <w:sz w:val="15"/>
               </w:rPr>
               <w:t>⌂  Douala / Ngaoundéré</w:t>
             </w:r>
           </w:p>
           <w:p>
             <w:pPr>
-              <w:spacing w:before="0" w:after="30" w:line="252" w:lineRule="auto"/>
+              <w:spacing w:before="0" w:after="20" w:line="252" w:lineRule="auto"/>
             </w:pPr>
             <w:r>
               <w:rPr>
                 <w:color w:val="F8FAFC"/>
-                <w:sz w:val="16"/>
+                <w:sz w:val="15"/>
               </w:rPr>
               <w:t>🌐  github.com/gervais-afk</w:t>
             </w:r>
           </w:p>
           <w:p>
             <w:pPr>
-              <w:spacing w:before="120" w:after="40"/>
+              <w:spacing w:before="100" w:after="20"/>
             </w:pPr>
             <w:r>
               <w:rPr>
                 <w:rFonts w:ascii="Segoe UI Semibold" w:hAnsi="Segoe UI Semibold"/>
                 <w:b/>
                 <w:color w:val="38BDF8"/>
-                <w:sz w:val="18"/>
+                <w:sz w:val="17"/>
               </w:rPr>
               <w:t>COMPÉTENCES &amp; OUTILS</w:t>
             </w:r>
           </w:p>
           <w:p>
             <w:pPr>
-              <w:spacing w:before="0" w:after="30" w:line="252" w:lineRule="auto"/>
+              <w:spacing w:before="0" w:after="20" w:line="252" w:lineRule="auto"/>
             </w:pPr>
             <w:r>
               <w:rPr>
                 <w:color w:val="F8FAFC"/>
-                <w:sz w:val="16"/>
+                <w:sz w:val="15"/>
               </w:rPr>
               <w:t>Gemma 4 / Gemini   ■ ■ ■ ■ ■</w:t>
             </w:r>
           </w:p>
           <w:p>
             <w:pPr>
-              <w:spacing w:before="0" w:after="30" w:line="252" w:lineRule="auto"/>
+              <w:spacing w:before="0" w:after="20" w:line="252" w:lineRule="auto"/>
             </w:pPr>
             <w:r>
               <w:rPr>
                 <w:color w:val="F8FAFC"/>
-                <w:sz w:val="16"/>
+                <w:sz w:val="15"/>
               </w:rPr>
-              <w:t>Neo4j GraphRAG (N10S) ■ ■ ■ ■ ■</w:t>
+              <w:t>Neo4j GraphRAG (N10S)■ ■ ■ ■ ■</w:t>
             </w:r>
           </w:p>
           <w:p>
             <w:pPr>
-              <w:spacing w:before="0" w:after="30" w:line="252" w:lineRule="auto"/>
+              <w:spacing w:before="0" w:after="20" w:line="252" w:lineRule="auto"/>
             </w:pPr>
             <w:r>
               <w:rPr>
                 <w:color w:val="F8FAFC"/>
-                <w:sz w:val="16"/>
+                <w:sz w:val="15"/>
               </w:rPr>
-              <w:t>Firebase Genkit / RAG  ■ ■ ■ ■ ■</w:t>
+              <w:t>Firebase Genkit/RAG  ■ ■ ■ ■ ■</w:t>
             </w:r>
           </w:p>
           <w:p>
             <w:pPr>
-              <w:spacing w:before="0" w:after="30" w:line="252" w:lineRule="auto"/>
+              <w:spacing w:before="0" w:after="20" w:line="252" w:lineRule="auto"/>
             </w:pPr>
             <w:r>
               <w:rPr>
                 <w:color w:val="F8FAFC"/>
-                <w:sz w:val="16"/>
+                <w:sz w:val="15"/>
               </w:rPr>
-              <w:t>Python (BAEL 91)       ■ ■ ■ ■ ■</w:t>
+              <w:t>Python (BAEL 91)     ■ ■ ■ ■ ■</w:t>
             </w:r>
           </w:p>
           <w:p>
             <w:pPr>
-              <w:spacing w:before="0" w:after="30" w:line="252" w:lineRule="auto"/>
+              <w:spacing w:before="0" w:after="20" w:line="252" w:lineRule="auto"/>
             </w:pPr>
             <w:r>
               <w:rPr>
                 <w:color w:val="F8FAFC"/>
-                <w:sz w:val="16"/>
+                <w:sz w:val="15"/>
               </w:rPr>
-              <w:t>IfcOpenShell (5D BIM)  ■ ■ ■ ■ □</w:t>
+              <w:t>IfcOpenShell (5D BIM)■ ■ ■ ■ □</w:t>
             </w:r>
           </w:p>
           <w:p>
             <w:pPr>
-              <w:spacing w:before="0" w:after="30" w:line="252" w:lineRule="auto"/>
+              <w:spacing w:before="0" w:after="20" w:line="252" w:lineRule="auto"/>
             </w:pPr>
             <w:r>
               <w:rPr>
                 <w:color w:val="F8FAFC"/>
-                <w:sz w:val="16"/>
+                <w:sz w:val="15"/>
               </w:rPr>
-              <w:t>PostgreSQL / SQL      ■ ■ ■ ■ ■</w:t>
+              <w:t>PostgreSQL / SQL    ■ ■ ■ ■ ■</w:t>
             </w:r>
           </w:p>
           <w:p>
             <w:pPr>
-              <w:spacing w:before="0" w:after="30" w:line="252" w:lineRule="auto"/>
+              <w:spacing w:before="0" w:after="20" w:line="252" w:lineRule="auto"/>
             </w:pPr>
             <w:r>
               <w:rPr>
                 <w:color w:val="F8FAFC"/>
-                <w:sz w:val="16"/>
+                <w:sz w:val="15"/>
               </w:rPr>
-              <w:t>Next.js 14 / React     ■ ■ ■ ■ □</w:t>
+              <w:t>Next.js 14 / React   ■ ■ ■ ■ □</w:t>
             </w:r>
           </w:p>
           <w:p>
             <w:pPr>
-              <w:spacing w:before="0" w:after="30" w:line="252" w:lineRule="auto"/>
+              <w:spacing w:before="0" w:after="20" w:line="252" w:lineRule="auto"/>
             </w:pPr>
             <w:r>
               <w:rPr>
                 <w:color w:val="F8FAFC"/>
-                <w:sz w:val="16"/>
+                <w:sz w:val="15"/>
               </w:rPr>
-              <w:t>FastAPI / Streamlit    ■ ■ ■ ■ ■</w:t>
+              <w:t>FastAPI / Streamlit  ■ ■ ■ ■ ■</w:t>
             </w:r>
           </w:p>
           <w:p>
             <w:pPr>
-              <w:spacing w:before="0" w:after="30" w:line="252" w:lineRule="auto"/>
+              <w:spacing w:before="0" w:after="20" w:line="252" w:lineRule="auto"/>
             </w:pPr>
             <w:r>
               <w:rPr>
                 <w:color w:val="F8FAFC"/>
-                <w:sz w:val="16"/>
+                <w:sz w:val="15"/>
               </w:rPr>
-              <w:t>MLflow (MLOps)/Docker  ■ ■ ■ ■ □</w:t>
+              <w:t>MLflow (MLOps)/Docker■ ■ ■ ■ □</w:t>
             </w:r>
           </w:p>
           <w:p>
             <w:pPr>
-              <w:spacing w:before="120" w:after="40"/>
+              <w:spacing w:before="100" w:after="20"/>
             </w:pPr>
             <w:r>
               <w:rPr>
                 <w:rFonts w:ascii="Segoe UI Semibold" w:hAnsi="Segoe UI Semibold"/>
                 <w:b/>
                 <w:color w:val="38BDF8"/>
-                <w:sz w:val="18"/>
+                <w:sz w:val="17"/>
               </w:rPr>
               <w:t>LANGUES</w:t>
             </w:r>
           </w:p>
           <w:p>
             <w:pPr>
-              <w:spacing w:before="0" w:after="30" w:line="252" w:lineRule="auto"/>
+              <w:spacing w:before="0" w:after="20" w:line="252" w:lineRule="auto"/>
             </w:pPr>
             <w:r>
               <w:rPr>
                 <w:color w:val="F8FAFC"/>
-                <w:sz w:val="16"/>
+                <w:sz w:val="15"/>
               </w:rPr>
               <w:t>Français   ■ ■ ■ ■ ■  (Courant)</w:t>
             </w:r>
           </w:p>
           <w:p>
             <w:pPr>
-              <w:spacing w:before="0" w:after="30" w:line="252" w:lineRule="auto"/>
+              <w:spacing w:before="0" w:after="20" w:line="252" w:lineRule="auto"/>
             </w:pPr>
             <w:r>
               <w:rPr>
                 <w:color w:val="F8FAFC"/>
-                <w:sz w:val="16"/>
+                <w:sz w:val="15"/>
               </w:rPr>
               <w:t>Anglais    ■ ■ ■ ■ □  (Pro/Tech)</w:t>
             </w:r>
           </w:p>
           <w:p>
             <w:pPr>
-              <w:spacing w:before="120" w:after="40"/>
+              <w:spacing w:before="100" w:after="20"/>
             </w:pPr>
             <w:r>
               <w:rPr>
                 <w:rFonts w:ascii="Segoe UI Semibold" w:hAnsi="Segoe UI Semibold"/>
                 <w:b/>
                 <w:color w:val="38BDF8"/>
-                <w:sz w:val="18"/>
+                <w:sz w:val="17"/>
               </w:rPr>
               <w:t>ATOUTS CLÉS</w:t>
             </w:r>
           </w:p>
           <w:p>
             <w:pPr>
-              <w:spacing w:before="0" w:after="30" w:line="252" w:lineRule="auto"/>
+              <w:spacing w:before="0" w:after="20" w:line="252" w:lineRule="auto"/>
             </w:pPr>
             <w:r>
               <w:rPr>
                 <w:color w:val="F8FAFC"/>
-                <w:sz w:val="16"/>
+                <w:sz w:val="15"/>
               </w:rPr>
               <w:t>◈ Double compétence IA &amp; Génie Civil</w:t>
             </w:r>
           </w:p>
           <w:p>
             <w:pPr>
-              <w:spacing w:before="0" w:after="30" w:line="252" w:lineRule="auto"/>
+              <w:spacing w:before="0" w:after="20" w:line="252" w:lineRule="auto"/>
             </w:pPr>
             <w:r>
               <w:rPr>
                 <w:color w:val="F8FAFC"/>
-                <w:sz w:val="16"/>
+                <w:sz w:val="15"/>
               </w:rPr>
               <w:t>◈ Gestion risques &amp; Sûreté AVSEC</w:t>
             </w:r>
           </w:p>
           <w:p>
             <w:pPr>
-              <w:spacing w:before="0" w:after="30" w:line="252" w:lineRule="auto"/>
+              <w:spacing w:before="0" w:after="20" w:line="252" w:lineRule="auto"/>
             </w:pPr>
             <w:r>
               <w:rPr>
                 <w:color w:val="F8FAFC"/>
-                <w:sz w:val="16"/>
+                <w:sz w:val="15"/>
               </w:rPr>
               <w:t>◈ Guardrails IA &amp; Calculs Sandbox</w:t>
             </w:r>
           </w:p>
           <w:p>
             <w:pPr>
-              <w:spacing w:before="0" w:after="30" w:line="252" w:lineRule="auto"/>
+              <w:spacing w:before="0" w:after="20" w:line="252" w:lineRule="auto"/>
             </w:pPr>
             <w:r>
               <w:rPr>
                 <w:color w:val="F8FAFC"/>
-                <w:sz w:val="16"/>
+                <w:sz w:val="15"/>
               </w:rPr>
-              <w:t>◈ Rigueur &amp; Souveraineté IA</w:t>
+              <w:t>◈ Rigueur &amp; Souveraineté logicielle</w:t>
             </w:r>
           </w:p>
           <w:p>
             <w:pPr>
-              <w:spacing w:before="120" w:after="40"/>
+              <w:spacing w:before="100" w:after="20"/>
             </w:pPr>
             <w:r>
               <w:rPr>
                 <w:rFonts w:ascii="Segoe UI Semibold" w:hAnsi="Segoe UI Semibold"/>
                 <w:b/>
                 <w:color w:val="38BDF8"/>
-                <w:sz w:val="18"/>
+                <w:sz w:val="17"/>
               </w:rPr>
-              <w:t>ENGAGEMENT</w:t>
+              <w:t>DISPONIBILITÉ</w:t>
             </w:r>
           </w:p>
           <w:p>
             <w:pPr>
-              <w:spacing w:before="0" w:after="30" w:line="252" w:lineRule="auto"/>
+              <w:spacing w:before="0" w:after="20" w:line="252" w:lineRule="auto"/>
             </w:pPr>
             <w:r>
               <w:rPr>
                 <w:color w:val="F8FAFC"/>
-                <w:sz w:val="16"/>
+                <w:sz w:val="15"/>
               </w:rPr>
               <w:t>◦ Statut : Disponible / Conseil</w:t>
             </w:r>
           </w:p>
           <w:p>
             <w:pPr>
-              <w:spacing w:before="0" w:after="30" w:line="252" w:lineRule="auto"/>
+              <w:spacing w:before="0" w:after="20" w:line="252" w:lineRule="auto"/>
             </w:pPr>
             <w:r>
               <w:rPr>
                 <w:color w:val="F8FAFC"/>
-                <w:sz w:val="16"/>
+                <w:sz w:val="15"/>
               </w:rPr>
               <w:t>◦ Mobilité : Remote / Intl</w:t>
+            </w:r>
+          </w:p>
+          <w:p>
+            <w:pPr>
+              <w:spacing w:before="0" w:after="20" w:line="252" w:lineRule="auto"/>
+            </w:pPr>
+            <w:r>
+              <w:rPr>
+                <w:color w:val="F8FAFC"/>
+                <w:sz w:val="15"/>
+              </w:rPr>
+              <w:t>◈ Réf. disponibles sur demande</w:t>
             </w:r>
           </w:p>
         </w:tc>
         <w:tc>
           <w:tcPr>
-            <w:tcW w:type="dxa" w:w="7344"/>
+            <w:tcW w:type="dxa" w:w="7632"/>
             <w:shd w:fill="FFFFFF"/>
             <w:tcMar>
-              <w:top w:w="120" w:type="dxa"/>
-              <w:bottom w:w="120" w:type="dxa"/>
-              <w:left w:w="160" w:type="dxa"/>
-              <w:right w:w="120" w:type="dxa"/>
+              <w:top w:w="100" w:type="dxa"/>
+              <w:bottom w:w="100" w:type="dxa"/>
+              <w:left w:w="140" w:type="dxa"/>
+              <w:right w:w="100" w:type="dxa"/>
             </w:tcMar>
           </w:tcPr>
           <w:p>
@@ -416,336 +429,9 @@
                 <w:rFonts w:ascii="Segoe UI" w:hAnsi="Segoe UI"/>
                 <w:b/>
                 <w:color w:val="0A1128"/>
-                <w:sz w:val="32"/>
+                <w:sz w:val="30"/>
               </w:rPr>
               <w:t>KOA MARIE GERVAIS NELLY</w:t>
-            </w:r>
-          </w:p>
-          <w:p>
-            <w:pPr>
-              <w:spacing w:before="0" w:after="40"/>
-            </w:pPr>
-            <w:r>
-              <w:rPr>
-                <w:b/>
-                <w:color w:val="0284C7"/>
-                <w:sz w:val="18"/>
-              </w:rPr>
-              <w:t>Lead AI Engineer &amp; Consultant IA / Data   │   Fondateur @ Archi Cam AI</w:t>
-            </w:r>
-          </w:p>
-          <w:p>
-            <w:pPr>
-              <w:spacing w:before="0" w:after="80"/>
-            </w:pPr>
-            <w:r>
-              <w:rPr>
-                <w:color w:val="0284C7"/>
-                <w:sz w:val="15"/>
-              </w:rPr>
-              <w:t>─── ◈ ────────────────────────────────────────────────── ◈ ───</w:t>
-            </w:r>
-          </w:p>
-          <w:p>
-            <w:pPr>
-              <w:spacing w:before="120" w:after="40"/>
-            </w:pPr>
-            <w:r>
-              <w:rPr>
-                <w:b/>
-                <w:color w:val="0284C7"/>
-                <w:sz w:val="18"/>
-              </w:rPr>
-              <w:t xml:space="preserve">◈  </w:t>
-            </w:r>
-            <w:r>
-              <w:rPr>
-                <w:rFonts w:ascii="Segoe UI" w:hAnsi="Segoe UI"/>
-                <w:b/>
-                <w:color w:val="0A1128"/>
-                <w:sz w:val="19"/>
-              </w:rPr>
-              <w:t>PROFIL SYNTHÉTIQUE</w:t>
-            </w:r>
-          </w:p>
-          <w:p>
-            <w:pPr>
-              <w:spacing w:before="0" w:after="80" w:line="259" w:lineRule="auto"/>
-            </w:pPr>
-            <w:r>
-              <w:rPr>
-                <w:color w:val="334155"/>
-                <w:sz w:val="17"/>
-              </w:rPr>
-              <w:t>Consultant IA &amp; Lead AI Engineer, j'accompagne les entreprises dans la transformation de leurs données complexes en leviers décisionnels à forte valeur ajoutée. Spécialiste des Agents IA autonomes, du GraphRAG (Neo4j N10S) et de la Business Intelligence sécurisée (Sovereign.BI), je développe des solutions d'IA souveraines, étanches et explicables (audits SHAP). Fondateur d'Archi Cam AI pour le Google Africa Applied AI Lab, j'allie méthodologie d'ingénieur et vision produit.</w:t>
-            </w:r>
-          </w:p>
-          <w:p>
-            <w:pPr>
-              <w:spacing w:before="120" w:after="40"/>
-            </w:pPr>
-            <w:r>
-              <w:rPr>
-                <w:b/>
-                <w:color w:val="0284C7"/>
-                <w:sz w:val="18"/>
-              </w:rPr>
-              <w:t xml:space="preserve">◈  </w:t>
-            </w:r>
-            <w:r>
-              <w:rPr>
-                <w:rFonts w:ascii="Segoe UI" w:hAnsi="Segoe UI"/>
-                <w:b/>
-                <w:color w:val="0A1128"/>
-                <w:sz w:val="19"/>
-              </w:rPr>
-              <w:t>PROJETS IA MAJEURS &amp; RÉALISATIONS</w:t>
-            </w:r>
-          </w:p>
-          <w:p>
-            <w:pPr>
-              <w:spacing w:before="60" w:after="20"/>
-            </w:pPr>
-            <w:r>
-              <w:rPr>
-                <w:b/>
-                <w:color w:val="0A1128"/>
-                <w:sz w:val="18"/>
-              </w:rPr>
-              <w:t xml:space="preserve">Archi Cam AI 🏛️  </w:t>
-            </w:r>
-            <w:r>
-              <w:rPr>
-                <w:i/>
-                <w:color w:val="0284C7"/>
-                <w:sz w:val="16"/>
-              </w:rPr>
-              <w:t>–  SaaS IA Agentique &amp; 5D BIM (Candidature Google Africa Applied AI Lab)</w:t>
-            </w:r>
-          </w:p>
-          <w:p>
-            <w:pPr>
-              <w:spacing w:before="0" w:after="20"/>
-              <w:ind w:left="144"/>
-            </w:pPr>
-            <w:r>
-              <w:rPr>
-                <w:b/>
-                <w:color w:val="0284C7"/>
-              </w:rPr>
-              <w:t xml:space="preserve">▸  </w:t>
-            </w:r>
-            <w:r>
-              <w:rPr>
-                <w:color w:val="334155"/>
-                <w:sz w:val="16"/>
-              </w:rPr>
-              <w:t>Plateforme IA souveraine de modélisation BIM 5D et devis BTP normés (BAEL 91 / Eurocodes).</w:t>
-            </w:r>
-          </w:p>
-          <w:p>
-            <w:pPr>
-              <w:spacing w:before="0" w:after="20"/>
-              <w:ind w:left="144"/>
-            </w:pPr>
-            <w:r>
-              <w:rPr>
-                <w:b/>
-                <w:color w:val="0284C7"/>
-              </w:rPr>
-              <w:t xml:space="preserve">▸  </w:t>
-            </w:r>
-            <w:r>
-              <w:rPr>
-                <w:color w:val="334155"/>
-                <w:sz w:val="16"/>
-              </w:rPr>
-              <w:t>Moteur hybride Google Gemma 4 12B local + Gemini 1.5 Pro + Python Sandbox (IfcOpenShell).</w:t>
-            </w:r>
-          </w:p>
-          <w:p>
-            <w:pPr>
-              <w:spacing w:before="0" w:after="20"/>
-              <w:ind w:left="144"/>
-            </w:pPr>
-            <w:r>
-              <w:rPr>
-                <w:b/>
-                <w:color w:val="0284C7"/>
-              </w:rPr>
-              <w:t xml:space="preserve">▸  </w:t>
-            </w:r>
-            <w:r>
-              <w:rPr>
-                <w:color w:val="334155"/>
-                <w:sz w:val="16"/>
-              </w:rPr>
-              <w:t>Génération de devis Excel (DQE) en &lt; 2 min et rendus HD via Imagen 3 + ControlNet.</w:t>
-            </w:r>
-          </w:p>
-          <w:p>
-            <w:pPr>
-              <w:spacing w:before="60" w:after="20"/>
-            </w:pPr>
-            <w:r>
-              <w:rPr>
-                <w:b/>
-                <w:color w:val="0A1128"/>
-                <w:sz w:val="18"/>
-              </w:rPr>
-              <w:t xml:space="preserve">Sovereign.BI Agentic 📊  </w:t>
-            </w:r>
-            <w:r>
-              <w:rPr>
-                <w:i/>
-                <w:color w:val="0284C7"/>
-                <w:sz w:val="16"/>
-              </w:rPr>
-              <w:t>–  Business Intelligence Agentique &amp; Guardrails</w:t>
-            </w:r>
-          </w:p>
-          <w:p>
-            <w:pPr>
-              <w:spacing w:before="0" w:after="20"/>
-              <w:ind w:left="144"/>
-            </w:pPr>
-            <w:r>
-              <w:rPr>
-                <w:b/>
-                <w:color w:val="0284C7"/>
-              </w:rPr>
-              <w:t xml:space="preserve">▸  </w:t>
-            </w:r>
-            <w:r>
-              <w:rPr>
-                <w:color w:val="334155"/>
-                <w:sz w:val="16"/>
-              </w:rPr>
-              <w:t>Moteur décisionnel d'interrogation de bases SQL en langage naturel (React, FastAPI, PostgreSQL).</w:t>
-            </w:r>
-          </w:p>
-          <w:p>
-            <w:pPr>
-              <w:spacing w:before="0" w:after="20"/>
-              <w:ind w:left="144"/>
-            </w:pPr>
-            <w:r>
-              <w:rPr>
-                <w:b/>
-                <w:color w:val="0284C7"/>
-              </w:rPr>
-              <w:t xml:space="preserve">▸  </w:t>
-            </w:r>
-            <w:r>
-              <w:rPr>
-                <w:color w:val="334155"/>
-                <w:sz w:val="16"/>
-              </w:rPr>
-              <w:t>Orchestrateur TypeScript, Neo4j N10S (GraphRAG) et auditeur d'explicabilité SHAP Sentinel.</w:t>
-            </w:r>
-          </w:p>
-          <w:p>
-            <w:pPr>
-              <w:spacing w:before="60" w:after="20"/>
-            </w:pPr>
-            <w:r>
-              <w:rPr>
-                <w:b/>
-                <w:color w:val="0A1128"/>
-                <w:sz w:val="18"/>
-              </w:rPr>
-              <w:t xml:space="preserve">Dataset Automator ⚙️ &amp; VigieSahel 🌾  </w:t>
-            </w:r>
-            <w:r>
-              <w:rPr>
-                <w:i/>
-                <w:color w:val="0284C7"/>
-                <w:sz w:val="16"/>
-              </w:rPr>
-              <w:t>–  MLOps &amp; IA Impact Climat / Santé</w:t>
-            </w:r>
-          </w:p>
-          <w:p>
-            <w:pPr>
-              <w:spacing w:before="0" w:after="20"/>
-              <w:ind w:left="144"/>
-            </w:pPr>
-            <w:r>
-              <w:rPr>
-                <w:b/>
-                <w:color w:val="0284C7"/>
-              </w:rPr>
-              <w:t xml:space="preserve">▸  </w:t>
-            </w:r>
-            <w:r>
-              <w:rPr>
-                <w:color w:val="334155"/>
-                <w:sz w:val="16"/>
-              </w:rPr>
-              <w:t>Dataset Automator : Pipeline RAG d'évaluation séries temporelles (Neo4j, MLflow, Genkit, Gemma-2).</w:t>
-            </w:r>
-          </w:p>
-          <w:p>
-            <w:pPr>
-              <w:spacing w:before="0" w:after="20"/>
-              <w:ind w:left="144"/>
-            </w:pPr>
-            <w:r>
-              <w:rPr>
-                <w:b/>
-                <w:color w:val="0284C7"/>
-              </w:rPr>
-              <w:t xml:space="preserve">▸  </w:t>
-            </w:r>
-            <w:r>
-              <w:rPr>
-                <w:color w:val="334155"/>
-                <w:sz w:val="16"/>
-              </w:rPr>
-              <w:t>VigieSahel : Plateforme prédictive des semis agricoles et suivi PM2.5 / méningite (Streamlit, Supabase, ML).</w:t>
-            </w:r>
-          </w:p>
-          <w:p>
-            <w:pPr>
-              <w:spacing w:before="120" w:after="40"/>
-            </w:pPr>
-            <w:r>
-              <w:rPr>
-                <w:b/>
-                <w:color w:val="0284C7"/>
-                <w:sz w:val="18"/>
-              </w:rPr>
-              <w:t xml:space="preserve">◈  </w:t>
-            </w:r>
-            <w:r>
-              <w:rPr>
-                <w:rFonts w:ascii="Segoe UI" w:hAnsi="Segoe UI"/>
-                <w:b/>
-                <w:color w:val="0A1128"/>
-                <w:sz w:val="19"/>
-              </w:rPr>
-              <w:t>PARCOURS PROFESSIONNEL</w:t>
-            </w:r>
-          </w:p>
-          <w:p>
-            <w:pPr>
-              <w:spacing w:before="60" w:after="20"/>
-            </w:pPr>
-            <w:r>
-              <w:rPr>
-                <w:b/>
-                <w:color w:val="0A1128"/>
-                <w:sz w:val="18"/>
-              </w:rPr>
-              <w:t xml:space="preserve">Consultant IA &amp; Data Science  </w:t>
-            </w:r>
-            <w:r>
-              <w:rPr>
-                <w:i/>
-                <w:color w:val="0284C7"/>
-                <w:sz w:val="16"/>
-              </w:rPr>
-              <w:t>(2025 – Présent)</w:t>
             </w:r>
           </w:p>
           <w:p>
@@ -755,95 +441,33 @@
             <w:r>
               <w:rPr>
                 <w:b/>
-                <w:color w:val="64748B"/>
-                <w:sz w:val="16"/>
+                <w:color w:val="0284C7"/>
+                <w:sz w:val="17"/>
               </w:rPr>
-              <w:t>Projets Indépendants &amp; Entreprises  │  Douala</w:t>
+              <w:t>Lead AI Engineer &amp; Consultant IA / Data   │   Fondateur @ Archi Cam AI</w:t>
             </w:r>
           </w:p>
           <w:p>
             <w:pPr>
-              <w:spacing w:before="0" w:after="20"/>
-              <w:ind w:left="144"/>
+              <w:spacing w:before="0" w:after="60"/>
+            </w:pPr>
+            <w:r>
+              <w:rPr>
+                <w:color w:val="0284C7"/>
+                <w:sz w:val="14"/>
+              </w:rPr>
+              <w:t>─── ◈ ────────────────────────────────────────────────────────── ◈ ───</w:t>
+            </w:r>
+          </w:p>
+          <w:p>
+            <w:pPr>
+              <w:spacing w:before="100" w:after="30"/>
             </w:pPr>
             <w:r>
               <w:rPr>
                 <w:b/>
                 <w:color w:val="0284C7"/>
-              </w:rPr>
-              <w:t xml:space="preserve">▸  </w:t>
-            </w:r>
-            <w:r>
-              <w:rPr>
-                <w:color w:val="334155"/>
-                <w:sz w:val="16"/>
-              </w:rPr>
-              <w:t>Analyse exploratoire de données massives, modélisation de graphes de connaissances (Neo4j Cypher), pipelines RAG et bases SQL.</w:t>
-            </w:r>
-          </w:p>
-          <w:p>
-            <w:pPr>
-              <w:spacing w:before="60" w:after="20"/>
-            </w:pPr>
-            <w:r>
-              <w:rPr>
-                <w:b/>
-                <w:color w:val="0A1128"/>
-                <w:sz w:val="18"/>
-              </w:rPr>
-              <w:t xml:space="preserve">Agent de Sûreté Aéroportuaire (AVSEC)  </w:t>
-            </w:r>
-            <w:r>
-              <w:rPr>
-                <w:i/>
-                <w:color w:val="0284C7"/>
-                <w:sz w:val="16"/>
-              </w:rPr>
-              <w:t>(2018 – Présent)</w:t>
-            </w:r>
-          </w:p>
-          <w:p>
-            <w:pPr>
-              <w:spacing w:before="0" w:after="20"/>
-            </w:pPr>
-            <w:r>
-              <w:rPr>
-                <w:b/>
-                <w:color w:val="64748B"/>
-                <w:sz w:val="16"/>
-              </w:rPr>
-              <w:t>CCAA (Autorité Aéronautique du Cameroun)</w:t>
-            </w:r>
-          </w:p>
-          <w:p>
-            <w:pPr>
-              <w:spacing w:before="0" w:after="20"/>
-              <w:ind w:left="144"/>
-            </w:pPr>
-            <w:r>
-              <w:rPr>
-                <w:b/>
-                <w:color w:val="0284C7"/>
-              </w:rPr>
-              <w:t xml:space="preserve">▸  </w:t>
-            </w:r>
-            <w:r>
-              <w:rPr>
-                <w:color w:val="334155"/>
-                <w:sz w:val="16"/>
-              </w:rPr>
-              <w:t>Analyse des risques opérationnels critiques, contrôle d'accès sécurisés et rédaction de rapports d'audit de sûreté.</w:t>
-            </w:r>
-          </w:p>
-          <w:p>
-            <w:pPr>
-              <w:spacing w:before="120" w:after="40"/>
-            </w:pPr>
-            <w:r>
-              <w:rPr>
-                <w:b/>
-                <w:color w:val="0284C7"/>
-                <w:sz w:val="18"/>
+                <w:sz w:val="17"/>
               </w:rPr>
               <w:t xml:space="preserve">◈  </w:t>
             </w:r>
@@ -852,14 +476,412 @@
                 <w:rFonts w:ascii="Segoe UI" w:hAnsi="Segoe UI"/>
                 <w:b/>
                 <w:color w:val="0A1128"/>
-                <w:sz w:val="19"/>
+                <w:sz w:val="18"/>
+              </w:rPr>
+              <w:t>PROFIL SYNTHÉTIQUE</w:t>
+            </w:r>
+          </w:p>
+          <w:p>
+            <w:pPr>
+              <w:spacing w:before="0" w:after="60" w:line="252" w:lineRule="auto"/>
+            </w:pPr>
+            <w:r>
+              <w:rPr>
+                <w:color w:val="334155"/>
+                <w:sz w:val="16"/>
+              </w:rPr>
+              <w:t>Consultant IA &amp; Lead AI Engineer, j'accompagne les entreprises dans la transformation de leurs données complexes en leviers décisionnels à forte valeur ajoutée. Spécialiste des Agents IA autonomes, du GraphRAG (Neo4j N10S) et de la Business Intelligence sécurisée (Sovereign.BI), je développe des solutions d'IA souveraines, étanches et explicables (audits SHAP). Fondateur d'Archi Cam AI pour le Google Africa Applied AI Lab, j'allie méthodologie d'ingénieur et vision produit.</w:t>
+            </w:r>
+          </w:p>
+          <w:p>
+            <w:pPr>
+              <w:spacing w:before="100" w:after="30"/>
+            </w:pPr>
+            <w:r>
+              <w:rPr>
+                <w:b/>
+                <w:color w:val="0284C7"/>
+                <w:sz w:val="17"/>
+              </w:rPr>
+              <w:t xml:space="preserve">◈  </w:t>
+            </w:r>
+            <w:r>
+              <w:rPr>
+                <w:rFonts w:ascii="Segoe UI" w:hAnsi="Segoe UI"/>
+                <w:b/>
+                <w:color w:val="0A1128"/>
+                <w:sz w:val="18"/>
+              </w:rPr>
+              <w:t>PROJETS IA MAJEURS &amp; RÉALISATIONS</w:t>
+            </w:r>
+          </w:p>
+          <w:p>
+            <w:pPr>
+              <w:spacing w:before="50" w:after="10"/>
+            </w:pPr>
+            <w:r>
+              <w:rPr>
+                <w:b/>
+                <w:color w:val="0A1128"/>
+                <w:sz w:val="17"/>
+              </w:rPr>
+              <w:t xml:space="preserve">Archi Cam AI 🏛️  </w:t>
+            </w:r>
+            <w:r>
+              <w:rPr>
+                <w:i/>
+                <w:color w:val="0284C7"/>
+                <w:sz w:val="15"/>
+              </w:rPr>
+              <w:t>–  SaaS IA Agentique &amp; 5D BIM (Candidature Google Africa Applied AI Lab)</w:t>
+            </w:r>
+          </w:p>
+          <w:p>
+            <w:pPr>
+              <w:spacing w:before="0" w:after="10"/>
+              <w:ind w:left="144"/>
+            </w:pPr>
+            <w:r>
+              <w:rPr>
+                <w:b/>
+                <w:color w:val="0284C7"/>
+                <w:sz w:val="15"/>
+              </w:rPr>
+              <w:t xml:space="preserve">▸  </w:t>
+            </w:r>
+            <w:r>
+              <w:rPr>
+                <w:color w:val="334155"/>
+                <w:sz w:val="15"/>
+              </w:rPr>
+              <w:t>Plateforme IA souveraine de modélisation BIM 5D et devis BTP normés (BAEL 91 / Eurocodes).</w:t>
+            </w:r>
+          </w:p>
+          <w:p>
+            <w:pPr>
+              <w:spacing w:before="0" w:after="10"/>
+              <w:ind w:left="144"/>
+            </w:pPr>
+            <w:r>
+              <w:rPr>
+                <w:b/>
+                <w:color w:val="0284C7"/>
+                <w:sz w:val="15"/>
+              </w:rPr>
+              <w:t xml:space="preserve">▸  </w:t>
+            </w:r>
+            <w:r>
+              <w:rPr>
+                <w:color w:val="334155"/>
+                <w:sz w:val="15"/>
+              </w:rPr>
+              <w:t>Moteur hybride Google Gemma 4 12B local + Gemini 1.5 Pro + Python Sandbox (IfcOpenShell).</w:t>
+            </w:r>
+          </w:p>
+          <w:p>
+            <w:pPr>
+              <w:spacing w:before="0" w:after="10"/>
+              <w:ind w:left="144"/>
+            </w:pPr>
+            <w:r>
+              <w:rPr>
+                <w:b/>
+                <w:color w:val="0284C7"/>
+                <w:sz w:val="15"/>
+              </w:rPr>
+              <w:t xml:space="preserve">▸  </w:t>
+            </w:r>
+            <w:r>
+              <w:rPr>
+                <w:color w:val="334155"/>
+                <w:sz w:val="15"/>
+              </w:rPr>
+              <w:t>Génération de devis Excel (DQE) en &lt; 2 min et rendus HD via Imagen 3 + ControlNet.</w:t>
+            </w:r>
+          </w:p>
+          <w:p>
+            <w:pPr>
+              <w:spacing w:before="50" w:after="10"/>
+            </w:pPr>
+            <w:r>
+              <w:rPr>
+                <w:b/>
+                <w:color w:val="0A1128"/>
+                <w:sz w:val="17"/>
+              </w:rPr>
+              <w:t xml:space="preserve">Sovereign.BI Agentic 📊  </w:t>
+            </w:r>
+            <w:r>
+              <w:rPr>
+                <w:i/>
+                <w:color w:val="0284C7"/>
+                <w:sz w:val="15"/>
+              </w:rPr>
+              <w:t>–  Business Intelligence Agentique &amp; Guardrails</w:t>
+            </w:r>
+          </w:p>
+          <w:p>
+            <w:pPr>
+              <w:spacing w:before="0" w:after="10"/>
+              <w:ind w:left="144"/>
+            </w:pPr>
+            <w:r>
+              <w:rPr>
+                <w:b/>
+                <w:color w:val="0284C7"/>
+                <w:sz w:val="15"/>
+              </w:rPr>
+              <w:t xml:space="preserve">▸  </w:t>
+            </w:r>
+            <w:r>
+              <w:rPr>
+                <w:color w:val="334155"/>
+                <w:sz w:val="15"/>
+              </w:rPr>
+              <w:t>Moteur décisionnel d'interrogation de bases SQL en langage naturel (React, FastAPI, PostgreSQL).</w:t>
+            </w:r>
+          </w:p>
+          <w:p>
+            <w:pPr>
+              <w:spacing w:before="0" w:after="10"/>
+              <w:ind w:left="144"/>
+            </w:pPr>
+            <w:r>
+              <w:rPr>
+                <w:b/>
+                <w:color w:val="0284C7"/>
+                <w:sz w:val="15"/>
+              </w:rPr>
+              <w:t xml:space="preserve">▸  </w:t>
+            </w:r>
+            <w:r>
+              <w:rPr>
+                <w:color w:val="334155"/>
+                <w:sz w:val="15"/>
+              </w:rPr>
+              <w:t>Orchestrateur TypeScript, Neo4j N10S (GraphRAG) et auditeur d'explicabilité SHAP Sentinel.</w:t>
+            </w:r>
+          </w:p>
+          <w:p>
+            <w:pPr>
+              <w:spacing w:before="50" w:after="10"/>
+            </w:pPr>
+            <w:r>
+              <w:rPr>
+                <w:b/>
+                <w:color w:val="0A1128"/>
+                <w:sz w:val="17"/>
+              </w:rPr>
+              <w:t xml:space="preserve">Dataset Automator ⚙️ &amp; VigieSahel 🌾  </w:t>
+            </w:r>
+            <w:r>
+              <w:rPr>
+                <w:i/>
+                <w:color w:val="0284C7"/>
+                <w:sz w:val="15"/>
+              </w:rPr>
+              <w:t>–  MLOps &amp; IA Impact Climat / Santé</w:t>
+            </w:r>
+          </w:p>
+          <w:p>
+            <w:pPr>
+              <w:spacing w:before="0" w:after="10"/>
+              <w:ind w:left="144"/>
+            </w:pPr>
+            <w:r>
+              <w:rPr>
+                <w:b/>
+                <w:color w:val="0284C7"/>
+                <w:sz w:val="15"/>
+              </w:rPr>
+              <w:t xml:space="preserve">▸  </w:t>
+            </w:r>
+            <w:r>
+              <w:rPr>
+                <w:color w:val="334155"/>
+                <w:sz w:val="15"/>
+              </w:rPr>
+              <w:t>Dataset Automator : Pipeline RAG d'évaluation séries temporelles (Neo4j, MLflow, Genkit, Gemma-2).</w:t>
+            </w:r>
+          </w:p>
+          <w:p>
+            <w:pPr>
+              <w:spacing w:before="0" w:after="10"/>
+              <w:ind w:left="144"/>
+            </w:pPr>
+            <w:r>
+              <w:rPr>
+                <w:b/>
+                <w:color w:val="0284C7"/>
+                <w:sz w:val="15"/>
+              </w:rPr>
+              <w:t xml:space="preserve">▸  </w:t>
+            </w:r>
+            <w:r>
+              <w:rPr>
+                <w:color w:val="334155"/>
+                <w:sz w:val="15"/>
+              </w:rPr>
+              <w:t>VigieSahel : Plateforme prédictive des semis agricoles et suivi PM2.5 / méningite (Streamlit, Supabase, ML).</w:t>
+            </w:r>
+          </w:p>
+          <w:p>
+            <w:pPr>
+              <w:spacing w:before="100" w:after="30"/>
+            </w:pPr>
+            <w:r>
+              <w:rPr>
+                <w:b/>
+                <w:color w:val="0284C7"/>
+                <w:sz w:val="17"/>
+              </w:rPr>
+              <w:t xml:space="preserve">◈  </w:t>
+            </w:r>
+            <w:r>
+              <w:rPr>
+                <w:rFonts w:ascii="Segoe UI" w:hAnsi="Segoe UI"/>
+                <w:b/>
+                <w:color w:val="0A1128"/>
+                <w:sz w:val="18"/>
+              </w:rPr>
+              <w:t>PARCOURS PROFESSIONNEL</w:t>
+            </w:r>
+          </w:p>
+          <w:p>
+            <w:pPr>
+              <w:spacing w:before="50" w:after="10"/>
+            </w:pPr>
+            <w:r>
+              <w:rPr>
+                <w:b/>
+                <w:color w:val="0A1128"/>
+                <w:sz w:val="17"/>
+              </w:rPr>
+              <w:t xml:space="preserve">Consultant IA &amp; Data Science  </w:t>
+            </w:r>
+            <w:r>
+              <w:rPr>
+                <w:i/>
+                <w:color w:val="0284C7"/>
+                <w:sz w:val="15"/>
+              </w:rPr>
+              <w:t>(2025 – Présent)</w:t>
+            </w:r>
+          </w:p>
+          <w:p>
+            <w:pPr>
+              <w:spacing w:before="0" w:after="10"/>
+            </w:pPr>
+            <w:r>
+              <w:rPr>
+                <w:b/>
+                <w:color w:val="64748B"/>
+                <w:sz w:val="15"/>
+              </w:rPr>
+              <w:t>Projets Indépendants &amp; Entreprises  │  Douala</w:t>
+            </w:r>
+          </w:p>
+          <w:p>
+            <w:pPr>
+              <w:spacing w:before="0" w:after="10"/>
+              <w:ind w:left="144"/>
+            </w:pPr>
+            <w:r>
+              <w:rPr>
+                <w:b/>
+                <w:color w:val="0284C7"/>
+                <w:sz w:val="15"/>
+              </w:rPr>
+              <w:t xml:space="preserve">▸  </w:t>
+            </w:r>
+            <w:r>
+              <w:rPr>
+                <w:color w:val="334155"/>
+                <w:sz w:val="15"/>
+              </w:rPr>
+              <w:t>Analyse exploratoire de données massives, modélisation de graphes (Neo4j Cypher), RAG &amp; SQL.</w:t>
+            </w:r>
+          </w:p>
+          <w:p>
+            <w:pPr>
+              <w:spacing w:before="50" w:after="10"/>
+            </w:pPr>
+            <w:r>
+              <w:rPr>
+                <w:b/>
+                <w:color w:val="0A1128"/>
+                <w:sz w:val="17"/>
+              </w:rPr>
+              <w:t xml:space="preserve">Agent de Sûreté Aéroportuaire (AVSEC)  </w:t>
+            </w:r>
+            <w:r>
+              <w:rPr>
+                <w:i/>
+                <w:color w:val="0284C7"/>
+                <w:sz w:val="15"/>
+              </w:rPr>
+              <w:t>(2018 – Présent)</w:t>
+            </w:r>
+          </w:p>
+          <w:p>
+            <w:pPr>
+              <w:spacing w:before="0" w:after="10"/>
+            </w:pPr>
+            <w:r>
+              <w:rPr>
+                <w:b/>
+                <w:color w:val="64748B"/>
+                <w:sz w:val="15"/>
+              </w:rPr>
+              <w:t>CCAA (Autorité Aéronautique du Cameroun)</w:t>
+            </w:r>
+          </w:p>
+          <w:p>
+            <w:pPr>
+              <w:spacing w:before="0" w:after="10"/>
+              <w:ind w:left="144"/>
+            </w:pPr>
+            <w:r>
+              <w:rPr>
+                <w:b/>
+                <w:color w:val="0284C7"/>
+                <w:sz w:val="15"/>
+              </w:rPr>
+              <w:t xml:space="preserve">▸  </w:t>
+            </w:r>
+            <w:r>
+              <w:rPr>
+                <w:color w:val="334155"/>
+                <w:sz w:val="15"/>
+              </w:rPr>
+              <w:t>Analyse des risques opérationnels critiques, contrôle d'accès et audits de sûreté.</w:t>
+            </w:r>
+          </w:p>
+          <w:p>
+            <w:pPr>
+              <w:spacing w:before="100" w:after="30"/>
+            </w:pPr>
+            <w:r>
+              <w:rPr>
+                <w:b/>
+                <w:color w:val="0284C7"/>
+                <w:sz w:val="17"/>
+              </w:rPr>
+              <w:t xml:space="preserve">◈  </w:t>
+            </w:r>
+            <w:r>
+              <w:rPr>
+                <w:rFonts w:ascii="Segoe UI" w:hAnsi="Segoe UI"/>
+                <w:b/>
+                <w:color w:val="0A1128"/>
+                <w:sz w:val="18"/>
               </w:rPr>
               <w:t>FORMATION ACADÉMIQUE</w:t>
             </w:r>
           </w:p>
           <w:p>
             <w:pPr>
-              <w:spacing w:before="40" w:after="20"/>
+              <w:spacing w:before="30" w:after="10"/>
             </w:pPr>
             <w:r>
               <w:rPr>
@@ -873,26 +895,26 @@
               <w:rPr>
                 <w:i/>
                 <w:color w:val="0284C7"/>
-                <w:sz w:val="16"/>
+                <w:sz w:val="15"/>
               </w:rPr>
               <w:t>(2025 – 2027)</w:t>
             </w:r>
           </w:p>
           <w:p>
             <w:pPr>
-              <w:spacing w:before="0" w:after="20"/>
+              <w:spacing w:before="0" w:after="10"/>
             </w:pPr>
             <w:r>
               <w:rPr>
                 <w:color w:val="64748B"/>
-                <w:sz w:val="16"/>
+                <w:sz w:val="15"/>
               </w:rPr>
               <w:t>Université de Ngaoundéré  │  Graphes (Neo4j), MLOps &amp; LLM</w:t>
             </w:r>
           </w:p>
           <w:p>
             <w:pPr>
-              <w:spacing w:before="40" w:after="20"/>
+              <w:spacing w:before="30" w:after="10"/>
             </w:pPr>
             <w:r>
               <w:rPr>
@@ -906,19 +928,19 @@
               <w:rPr>
                 <w:i/>
                 <w:color w:val="0284C7"/>
-                <w:sz w:val="16"/>
+                <w:sz w:val="15"/>
               </w:rPr>
               <w:t>(2015 – 2016)</w:t>
             </w:r>
           </w:p>
           <w:p>
             <w:pPr>
-              <w:spacing w:before="0" w:after="20"/>
+              <w:spacing w:before="0" w:after="10"/>
             </w:pPr>
             <w:r>
               <w:rPr>
                 <w:color w:val="64748B"/>
-                <w:sz w:val="16"/>
+                <w:sz w:val="15"/>
               </w:rPr>
               <w:t>ISTDI / IUC Douala  │  Dimensionnement BAEL 91 &amp; Métrés BTP</w:t>
             </w:r>
@@ -928,7 +950,7 @@
     </w:tbl>
     <w:sectPr>
       <w:pgSz w:w="12240" w:h="15840"/>
-      <w:pgMar w:top="360" w:right="360" w:bottom="360" w:left="360" w:header="720" w:footer="720" w:gutter="0"/>
+      <w:pgMar w:top="288" w:right="288" w:bottom="288" w:left="288" w:header="720" w:footer="720" w:gutter="0"/>
       <w:cols w:space="720"/>
       <w:docGrid w:linePitch="360"/>
     </w:sectPr>
@@ -1301,7 +1323,7 @@
     <w:rsid w:val="00FC693F"/>
     <w:rPr>
       <w:rFonts w:ascii="Segoe UI" w:hAnsi="Segoe UI"/>
-      <w:sz w:val="17"/>
+      <w:sz w:val="16"/>
     </w:rPr>
   </w:style>
   <w:style w:type="paragraph" w:styleId="Header">

</xml_diff>